<commit_message>
chore: snapshot diario 2026-10-13
Co-Authored-By: Claude Opus 5.5 <noreply@anthropic.com>
</commit_message>
<xml_diff>
--- a/output/2026-10-12/Wahed - Marketing Manager/01_CV_y_Carta/Paula De Francisco - CV.docx
+++ b/output/2026-10-12/Wahed - Marketing Manager/01_CV_y_Carta/Paula De Francisco - CV.docx
@@ -166,7 +166,7 @@
           <w:color w:val="1E1E1E"/>
           <w:sz w:val="20"/>
         </w:rPr>
-        <w:t>Hands-on marketing manager with 5 years across consumer brands and digital marketplaces. Brand &amp; Marketing Manager at DoFreeze in Dubai, running paid social and search, content, influencer, affiliate and platform partnerships with a team of two, and judging campaigns on incremental sales, not reach. Previously grew 42 brands +30% GMV QoQ at Alibaba's Miravia.</w:t>
+        <w:t>Hands-on marketing manager with 5 years across consumer brands and digital marketplaces. Brand &amp; Marketing Manager at DoFreeze in Dubai, running paid, social, email, influencer, affiliate and event marketing with a team of two, and judging campaigns on incremental sales, not reach. Previously grew 42 brands +30% GMV QoQ at Alibaba's Miravia.</w:t>
       </w:r>
     </w:p>
     <w:p>
@@ -263,7 +263,7 @@
           <w:color w:val="323232"/>
           <w:sz w:val="19"/>
         </w:rPr>
-        <w:t>DoFreeze LLC · UAE F&amp;B / FMCG group | Befit, Eurocake (incl. SMASH), Flair | sold in 50+ countries · Dubai, UAE</w:t>
+        <w:t>DoFreeze LLC · UAE F&amp;B / FMCG group | 7 brands incl. Befit, Eurocake, SMASH | sold in 50+ countries · Dubai, UAE</w:t>
       </w:r>
     </w:p>
     <w:p>
@@ -280,7 +280,7 @@
         </w:rPr>
         <w:t>•</w:t>
         <w:tab/>
-        <w:t>Lead marketing across 50+ markets with a team of two (designer, social media exec): a year-round seasonal calendar (Ramadan, New Year, back to school), 6 product launches, and paid social and search on Meta and Google Ads</w:t>
+        <w:t>Lead marketing for 7 brands across 50+ markets with a team of two (designer, social media exec): seasonal campaign calendar, 6 product launches, 4 social accounts with weekly creative-hook tests</w:t>
       </w:r>
     </w:p>
     <w:p>
@@ -297,7 +297,7 @@
         </w:rPr>
         <w:t>•</w:t>
         <w:tab/>
-        <w:t>Built the influencer programme from zero: 103 creator activations over 3 campaigns at AED 81 per content piece (market rate AED 1,000–3,500); negotiated −30% with the agency and audited its reach reporting</w:t>
+        <w:t>Paid social and search on Meta and Google Ads: built a dynamic-catalogue retargeting campaign at 3.7x ROAS and AED 34.5 per purchase in week one; shift budget between channels on break-even ROAS</w:t>
       </w:r>
     </w:p>
     <w:p>
@@ -314,7 +314,7 @@
         </w:rPr>
         <w:t>•</w:t>
         <w:tab/>
-        <w:t>Measure campaigns on incremental sales: SMASH x talabat lifted daily sales +165% vs +4.7% for a control brand (~AED 32K incremental on ~AED 8.7K spend); Befit x Noon added 4,176 incremental units (+31% vs baseline)</w:t>
+        <w:t>Built the influencer programme from zero: 103 creator activations over 3 waves on ~AED 25K (AED 81 per content piece); compared 4 agencies, negotiated −30% and audited the agency's reach reporting</w:t>
       </w:r>
     </w:p>
     <w:p>
@@ -331,7 +331,24 @@
         </w:rPr>
         <w:t>•</w:t>
         <w:tab/>
-        <w:t>Launched an affiliate programme (commission on sales, AI-built landing page, multilingual AI avatar brief), a purchase-to-enter cashback giveaway with talabat, and community activations with running, padel and yoga clubs</w:t>
+        <w:t>Measure on incremental sales: the SMASH x talabat purchase-to-enter giveaway lifted daily sales +165% vs +4.7% for a control brand; Befit x Noon added 4,176 incremental units (+31% vs baseline)</w:t>
+      </w:r>
+    </w:p>
+    <w:p>
+      <w:pPr>
+        <w:spacing w:before="0" w:after="0" w:line="230" w:lineRule="exact"/>
+        <w:ind w:left="180" w:hanging="180"/>
+      </w:pPr>
+      <w:r>
+        <w:rPr>
+          <w:rFonts w:ascii="Calibri" w:hAnsi="Calibri"/>
+          <w:b w:val="0"/>
+          <w:color w:val="1E1E1E"/>
+          <w:sz w:val="20"/>
+        </w:rPr>
+        <w:t>•</w:t>
+        <w:tab/>
+        <w:t>Web orders +86% and revenue +57% (Q1 vs Jun–Aug 2026) after adding Judge.me reviews, basket-based bundles and a 30-day replenishment flow; segmented a 16K email base for deliverability</w:t>
       </w:r>
     </w:p>
     <w:p>
@@ -348,7 +365,7 @@
         </w:rPr>
         <w:t>•</w:t>
         <w:tab/>
-        <w:t>Run the Shopify store; built a Claude system automating campaign planning, content and reporting (~40% less manual work)</w:t>
+        <w:t>Designed the Befit Crew affiliate programme (BixGrow, personal codes, tiered commissions); ran sampling and events incl. Saudi Food Show 2026 and a Sun &amp; Sand Sports x Fabletics yoga session that led to a listing proposal</w:t>
       </w:r>
     </w:p>
     <w:tbl>
@@ -423,7 +440,7 @@
           <w:color w:val="323232"/>
           <w:sz w:val="19"/>
         </w:rPr>
-        <w:t>Miravia (Alibaba Group) · Alibaba's e-commerce marketplace in Spain · Madrid, Spain</w:t>
+        <w:t>Miravia &amp; AliExpress (Alibaba Group) · Beauty &amp; Health department · Madrid, Spain</w:t>
       </w:r>
     </w:p>
     <w:p>
@@ -440,7 +457,24 @@
         </w:rPr>
         <w:t>•</w:t>
         <w:tab/>
-        <w:t>Grew 42 beauty, fragrance and fashion brands (incl. KIKO Milano) +30% GMV QoQ through pricing, assortment and promotions; owned the Flash Sales channel, reporting to the CEO against P&amp;L targets</w:t>
+        <w:t>Grew 42 beauty and fragrance brands (incl. L'Oréal Paris, Maybelline, NYX, Redken, KIKO Milano) +30% GMV QoQ through pricing, assortment, promotions and on-site visibility; worked with marketing, product and ops</w:t>
+      </w:r>
+    </w:p>
+    <w:p>
+      <w:pPr>
+        <w:spacing w:before="0" w:after="0" w:line="230" w:lineRule="exact"/>
+        <w:ind w:left="180" w:hanging="180"/>
+      </w:pPr>
+      <w:r>
+        <w:rPr>
+          <w:rFonts w:ascii="Calibri" w:hAnsi="Calibri"/>
+          <w:b w:val="0"/>
+          <w:color w:val="1E1E1E"/>
+          <w:sz w:val="20"/>
+        </w:rPr>
+        <w:t>•</w:t>
+        <w:tab/>
+        <w:t>Spotted the Arabian-perfume trend and grew it into one of Beauty &amp; Health's fastest-growing sub-categories, onboarding 30+ stores in two months (incl. Lattafa and Arabian Oud distributors)</w:t>
       </w:r>
     </w:p>
     <w:p>
@@ -457,7 +491,7 @@
         </w:rPr>
         <w:t>•</w:t>
         <w:tab/>
-        <w:t>Created the Beauty Club loyalty and Hot on Social programmes; as fragrance lead, onboarded 30+ stores in two months</w:t>
+        <w:t>Owned the Flash Sales channel (up to ~30% of B&amp;H sales), reporting to the CEO; created the Beauty Club loyalty programme</w:t>
       </w:r>
     </w:p>
     <w:tbl>
@@ -549,7 +583,7 @@
         </w:rPr>
         <w:t>•</w:t>
         <w:tab/>
-        <w:t>Co-managed large restaurant-chain accounts in the XL team (KFC, Taco Bell, La Tagliatella, Vicio): promotions and promo budgets, account performance, and cancellation and refund issues</w:t>
+        <w:t>Co-managed 5 XL restaurant accounts (KFC, Taco Bell, Vicio): promotions, in-app visibility, weekly refund-fraud reviews</w:t>
       </w:r>
     </w:p>
     <w:tbl>
@@ -739,7 +773,7 @@
                 <w:color w:val="1E1E1E"/>
                 <w:sz w:val="19"/>
               </w:rPr>
-              <w:t>campaign planning, content &amp; copywriting, social media, influencer &amp; affiliate, partnerships</w:t>
+              <w:t>campaign planning, content &amp; copy, social media, influencer &amp; affiliate, events &amp; sampling</w:t>
             </w:r>
           </w:p>
         </w:tc>
@@ -801,7 +835,7 @@
                 <w:color w:val="1E1E1E"/>
                 <w:sz w:val="19"/>
               </w:rPr>
-              <w:t>Meta Ads, Google Ads (search), Instagram, TikTok, Shopify, CRO, EDM, Noon, talabat, Careem</w:t>
+              <w:t>Meta Ads, Google Ads, Shopify, CRO, email &amp; segmentation, Instagram, TikTok, Noon, talabat</w:t>
             </w:r>
           </w:p>
         </w:tc>
@@ -863,7 +897,7 @@
                 <w:color w:val="1E1E1E"/>
                 <w:sz w:val="19"/>
               </w:rPr>
-              <w:t>budget management, agency &amp; vendor negotiation, key account management, pricing, go-to-market</w:t>
+              <w:t>budget management, agency &amp; vendor negotiation, platform partnerships, key account management</w:t>
             </w:r>
           </w:p>
         </w:tc>
@@ -925,7 +959,7 @@
                 <w:color w:val="1E1E1E"/>
                 <w:sz w:val="19"/>
               </w:rPr>
-              <w:t>ROI, ROAS, incremental uplift vs control, KPI reporting, P&amp;L targets, Looker, Power BI, SAP</w:t>
+              <w:t>ROI, ROAS, break-even ROAS, incremental uplift vs control, KPI reporting, Looker, Power BI, SAP</w:t>
             </w:r>
           </w:p>
         </w:tc>
@@ -1087,7 +1121,7 @@
           <w:color w:val="787878"/>
           <w:sz w:val="18"/>
         </w:rPr>
-        <w:t>Specialisation: E-Commerce · Fashion Industry · Thesis grade: 9.5/10</w:t>
+        <w:t>Specialisation: E-Commerce · Fashion Industry · Thesis on e-commerce in fashion retail (9.5/10)</w:t>
       </w:r>
     </w:p>
     <w:p>

</xml_diff>